<commit_message>
Initial commit for SCR automation project
</commit_message>
<xml_diff>
--- a/templates/SCR_TEMPLATE_UPDATED.docx
+++ b/templates/SCR_TEMPLATE_UPDATED.docx
@@ -691,6 +691,7 @@
               <w:calendar w:val="gregorian"/>
             </w:date>
           </w:sdtPr>
+          <w:sdtEndPr/>
           <w:sdtContent>
             <w:tc>
               <w:tcPr>
@@ -794,6 +795,7 @@
                 <w:listItem w:displayText="No" w:value="No"/>
               </w:comboBox>
             </w:sdtPr>
+            <w:sdtEndPr/>
             <w:sdtContent>
               <w:p>
                 <w:pPr>
@@ -1074,6 +1076,7 @@
                   <w:calendar w:val="gregorian"/>
                 </w:date>
               </w:sdtPr>
+              <w:sdtEndPr/>
               <w:sdtContent>
                 <w:r>
                   <w:rPr>
@@ -1216,6 +1219,7 @@
                   <w14:uncheckedState w14:val="2610" w14:font="MS Gothic"/>
                 </w14:checkbox>
               </w:sdtPr>
+              <w:sdtEndPr/>
               <w:sdtContent>
                 <w:r>
                   <w:rPr>
@@ -1681,6 +1685,7 @@
                   <w14:uncheckedState w14:val="2610" w14:font="MS Gothic"/>
                 </w14:checkbox>
               </w:sdtPr>
+              <w:sdtEndPr/>
               <w:sdtContent>
                 <w:r>
                   <w:rPr>
@@ -1775,6 +1780,7 @@
                   <w14:uncheckedState w14:val="2610" w14:font="MS Gothic"/>
                 </w14:checkbox>
               </w:sdtPr>
+              <w:sdtEndPr/>
               <w:sdtContent>
                 <w:r>
                   <w:rPr>
@@ -1835,6 +1841,7 @@
                   <w14:uncheckedState w14:val="2610" w14:font="MS Gothic"/>
                 </w14:checkbox>
               </w:sdtPr>
+              <w:sdtEndPr/>
               <w:sdtContent>
                 <w:r>
                   <w:rPr>
@@ -1887,6 +1894,7 @@
                   <w14:uncheckedState w14:val="2610" w14:font="MS Gothic"/>
                 </w14:checkbox>
               </w:sdtPr>
+              <w:sdtEndPr/>
               <w:sdtContent>
                 <w:r>
                   <w:rPr>
@@ -1948,6 +1956,7 @@
                   <w14:uncheckedState w14:val="2610" w14:font="MS Gothic"/>
                 </w14:checkbox>
               </w:sdtPr>
+              <w:sdtEndPr/>
               <w:sdtContent>
                 <w:r>
                   <w:rPr>
@@ -2014,6 +2023,7 @@
                   <w14:uncheckedState w14:val="2610" w14:font="MS Gothic"/>
                 </w14:checkbox>
               </w:sdtPr>
+              <w:sdtEndPr/>
               <w:sdtContent>
                 <w:r>
                   <w:rPr>
@@ -2100,6 +2110,7 @@
                   <w14:uncheckedState w14:val="2610" w14:font="MS Gothic"/>
                 </w14:checkbox>
               </w:sdtPr>
+              <w:sdtEndPr/>
               <w:sdtContent>
                 <w:r>
                   <w:rPr>
@@ -2160,6 +2171,7 @@
                   <w14:uncheckedState w14:val="2610" w14:font="MS Gothic"/>
                 </w14:checkbox>
               </w:sdtPr>
+              <w:sdtEndPr/>
               <w:sdtContent>
                 <w:r>
                   <w:rPr>
@@ -2212,6 +2224,7 @@
                   <w14:uncheckedState w14:val="2610" w14:font="MS Gothic"/>
                 </w14:checkbox>
               </w:sdtPr>
+              <w:sdtEndPr/>
               <w:sdtContent>
                 <w:r>
                   <w:rPr>
@@ -2281,6 +2294,7 @@
                   <w14:uncheckedState w14:val="2610" w14:font="MS Gothic"/>
                 </w14:checkbox>
               </w:sdtPr>
+              <w:sdtEndPr/>
               <w:sdtContent>
                 <w:r>
                   <w:rPr>
@@ -2393,6 +2407,7 @@
                   <w14:uncheckedState w14:val="2610" w14:font="MS Gothic"/>
                 </w14:checkbox>
               </w:sdtPr>
+              <w:sdtEndPr/>
               <w:sdtContent>
                 <w:r>
                   <w:rPr>
@@ -2562,6 +2577,7 @@
                   <w14:uncheckedState w14:val="2610" w14:font="MS Gothic"/>
                 </w14:checkbox>
               </w:sdtPr>
+              <w:sdtEndPr/>
               <w:sdtContent>
                 <w:r>
                   <w:rPr>
@@ -2621,6 +2637,7 @@
                   <w14:uncheckedState w14:val="2610" w14:font="MS Gothic"/>
                 </w14:checkbox>
               </w:sdtPr>
+              <w:sdtEndPr/>
               <w:sdtContent>
                 <w:r>
                   <w:rPr>
@@ -2672,6 +2689,7 @@
                   <w14:uncheckedState w14:val="2610" w14:font="MS Gothic"/>
                 </w14:checkbox>
               </w:sdtPr>
+              <w:sdtEndPr/>
               <w:sdtContent>
                 <w:r>
                   <w:rPr>
@@ -2780,6 +2798,7 @@
                   <w14:uncheckedState w14:val="2610" w14:font="MS Gothic"/>
                 </w14:checkbox>
               </w:sdtPr>
+              <w:sdtEndPr/>
               <w:sdtContent>
                 <w:r>
                   <w:rPr>
@@ -3026,6 +3045,7 @@
                   <w:calendar w:val="gregorian"/>
                 </w:date>
               </w:sdtPr>
+              <w:sdtEndPr/>
               <w:sdtContent>
                 <w:r>
                   <w:rPr>
@@ -3160,6 +3180,7 @@
                   <w14:uncheckedState w14:val="2610" w14:font="MS Gothic"/>
                 </w14:checkbox>
               </w:sdtPr>
+              <w:sdtEndPr/>
               <w:sdtContent>
                 <w:r>
                   <w:rPr>
@@ -3213,6 +3234,7 @@
                   <w14:uncheckedState w14:val="2610" w14:font="MS Gothic"/>
                 </w14:checkbox>
               </w:sdtPr>
+              <w:sdtEndPr/>
               <w:sdtContent>
                 <w:r>
                   <w:rPr>
@@ -3283,6 +3305,7 @@
                   <w14:uncheckedState w14:val="2610" w14:font="MS Gothic"/>
                 </w14:checkbox>
               </w:sdtPr>
+              <w:sdtEndPr/>
               <w:sdtContent>
                 <w:r>
                   <w:rPr>
@@ -3432,6 +3455,7 @@
                   <w14:uncheckedState w14:val="2610" w14:font="MS Gothic"/>
                 </w14:checkbox>
               </w:sdtPr>
+              <w:sdtEndPr/>
               <w:sdtContent>
                 <w:r>
                   <w:rPr>
@@ -3546,6 +3570,7 @@
                   <w14:uncheckedState w14:val="2610" w14:font="MS Gothic"/>
                 </w14:checkbox>
               </w:sdtPr>
+              <w:sdtEndPr/>
               <w:sdtContent>
                 <w:r>
                   <w:rPr>
@@ -3598,6 +3623,7 @@
                   <w14:uncheckedState w14:val="2610" w14:font="MS Gothic"/>
                 </w14:checkbox>
               </w:sdtPr>
+              <w:sdtEndPr/>
               <w:sdtContent>
                 <w:r>
                   <w:rPr>
@@ -3771,6 +3797,7 @@
                   <w14:uncheckedState w14:val="2610" w14:font="MS Gothic"/>
                 </w14:checkbox>
               </w:sdtPr>
+              <w:sdtEndPr/>
               <w:sdtContent>
                 <w:r>
                   <w:rPr>
@@ -3880,6 +3907,7 @@
                   <w14:uncheckedState w14:val="2610" w14:font="MS Gothic"/>
                 </w14:checkbox>
               </w:sdtPr>
+              <w:sdtEndPr/>
               <w:sdtContent>
                 <w:r>
                   <w:rPr>
@@ -3939,6 +3967,7 @@
                   <w14:uncheckedState w14:val="2610" w14:font="MS Gothic"/>
                 </w14:checkbox>
               </w:sdtPr>
+              <w:sdtEndPr/>
               <w:sdtContent>
                 <w:r>
                   <w:rPr>
@@ -3990,6 +4019,7 @@
                   <w14:uncheckedState w14:val="2610" w14:font="MS Gothic"/>
                 </w14:checkbox>
               </w:sdtPr>
+              <w:sdtEndPr/>
               <w:sdtContent>
                 <w:r>
                   <w:rPr>
@@ -4058,6 +4088,7 @@
                   <w14:uncheckedState w14:val="2610" w14:font="MS Gothic"/>
                 </w14:checkbox>
               </w:sdtPr>
+              <w:sdtEndPr/>
               <w:sdtContent>
                 <w:r>
                   <w:rPr>
@@ -4959,6 +4990,7 @@
                   <w14:uncheckedState w14:val="2610" w14:font="MS Gothic"/>
                 </w14:checkbox>
               </w:sdtPr>
+              <w:sdtEndPr/>
               <w:sdtContent>
                 <w:r>
                   <w:rPr>
@@ -5003,6 +5035,7 @@
                   <w14:uncheckedState w14:val="2610" w14:font="MS Gothic"/>
                 </w14:checkbox>
               </w:sdtPr>
+              <w:sdtEndPr/>
               <w:sdtContent>
                 <w:r>
                   <w:rPr>
@@ -5044,6 +5077,7 @@
                   <w14:uncheckedState w14:val="2610" w14:font="MS Gothic"/>
                 </w14:checkbox>
               </w:sdtPr>
+              <w:sdtEndPr/>
               <w:sdtContent>
                 <w:r>
                   <w:rPr>
@@ -5111,6 +5145,7 @@
                   <w14:uncheckedState w14:val="2610" w14:font="MS Gothic"/>
                 </w14:checkbox>
               </w:sdtPr>
+              <w:sdtEndPr/>
               <w:sdtContent>
                 <w:r>
                   <w:rPr>
@@ -5152,6 +5187,7 @@
                   <w14:uncheckedState w14:val="2610" w14:font="MS Gothic"/>
                 </w14:checkbox>
               </w:sdtPr>
+              <w:sdtEndPr/>
               <w:sdtContent>
                 <w:r>
                   <w:rPr>
@@ -5193,6 +5229,7 @@
                   <w14:uncheckedState w14:val="2610" w14:font="MS Gothic"/>
                 </w14:checkbox>
               </w:sdtPr>
+              <w:sdtEndPr/>
               <w:sdtContent>
                 <w:r>
                   <w:rPr>
@@ -5260,6 +5297,7 @@
                   <w14:uncheckedState w14:val="2610" w14:font="MS Gothic"/>
                 </w14:checkbox>
               </w:sdtPr>
+              <w:sdtEndPr/>
               <w:sdtContent>
                 <w:r>
                   <w:rPr>
@@ -5301,6 +5339,7 @@
                   <w14:uncheckedState w14:val="2610" w14:font="MS Gothic"/>
                 </w14:checkbox>
               </w:sdtPr>
+              <w:sdtEndPr/>
               <w:sdtContent>
                 <w:r>
                   <w:rPr>
@@ -5342,6 +5381,7 @@
                   <w14:uncheckedState w14:val="2610" w14:font="MS Gothic"/>
                 </w14:checkbox>
               </w:sdtPr>
+              <w:sdtEndPr/>
               <w:sdtContent>
                 <w:r>
                   <w:rPr>
@@ -5409,6 +5449,7 @@
                   <w14:uncheckedState w14:val="2610" w14:font="MS Gothic"/>
                 </w14:checkbox>
               </w:sdtPr>
+              <w:sdtEndPr/>
               <w:sdtContent>
                 <w:r>
                   <w:rPr>
@@ -5450,6 +5491,7 @@
                   <w14:uncheckedState w14:val="2610" w14:font="MS Gothic"/>
                 </w14:checkbox>
               </w:sdtPr>
+              <w:sdtEndPr/>
               <w:sdtContent>
                 <w:r>
                   <w:rPr>
@@ -5491,6 +5533,7 @@
                   <w14:uncheckedState w14:val="2610" w14:font="MS Gothic"/>
                 </w14:checkbox>
               </w:sdtPr>
+              <w:sdtEndPr/>
               <w:sdtContent>
                 <w:r>
                   <w:rPr>
@@ -5558,6 +5601,7 @@
                   <w14:uncheckedState w14:val="2610" w14:font="MS Gothic"/>
                 </w14:checkbox>
               </w:sdtPr>
+              <w:sdtEndPr/>
               <w:sdtContent>
                 <w:r>
                   <w:rPr>
@@ -5599,6 +5643,7 @@
                   <w14:uncheckedState w14:val="2610" w14:font="MS Gothic"/>
                 </w14:checkbox>
               </w:sdtPr>
+              <w:sdtEndPr/>
               <w:sdtContent>
                 <w:r>
                   <w:rPr>
@@ -5640,6 +5685,7 @@
                   <w14:uncheckedState w14:val="2610" w14:font="MS Gothic"/>
                 </w14:checkbox>
               </w:sdtPr>
+              <w:sdtEndPr/>
               <w:sdtContent>
                 <w:r>
                   <w:rPr>
@@ -5707,6 +5753,7 @@
                   <w14:uncheckedState w14:val="2610" w14:font="MS Gothic"/>
                 </w14:checkbox>
               </w:sdtPr>
+              <w:sdtEndPr/>
               <w:sdtContent>
                 <w:r>
                   <w:rPr>
@@ -5748,6 +5795,7 @@
                   <w14:uncheckedState w14:val="2610" w14:font="MS Gothic"/>
                 </w14:checkbox>
               </w:sdtPr>
+              <w:sdtEndPr/>
               <w:sdtContent>
                 <w:r>
                   <w:rPr>
@@ -5789,6 +5837,7 @@
                   <w14:uncheckedState w14:val="2610" w14:font="MS Gothic"/>
                 </w14:checkbox>
               </w:sdtPr>
+              <w:sdtEndPr/>
               <w:sdtContent>
                 <w:r>
                   <w:rPr>
@@ -5849,13 +5898,14 @@
             </w:pPr>
             <w:sdt>
               <w:sdtPr>
-                <w:id w:val="-1185359554"/>
+                <w:id w:val="-620224819"/>
                 <w14:checkbox>
                   <w14:checked w14:val="0"/>
                   <w14:checkedState w14:val="00FE" w14:font="Wingdings"/>
                   <w14:uncheckedState w14:val="2610" w14:font="MS Gothic"/>
                 </w14:checkbox>
               </w:sdtPr>
+              <w:sdtEndPr/>
               <w:sdtContent>
                 <w:r>
                   <w:rPr>
@@ -5890,13 +5940,14 @@
             </w:pPr>
             <w:sdt>
               <w:sdtPr>
-                <w:id w:val="988444130"/>
+                <w:id w:val="-560395889"/>
                 <w14:checkbox>
                   <w14:checked w14:val="0"/>
                   <w14:checkedState w14:val="00FE" w14:font="Wingdings"/>
                   <w14:uncheckedState w14:val="2610" w14:font="MS Gothic"/>
                 </w14:checkbox>
               </w:sdtPr>
+              <w:sdtEndPr/>
               <w:sdtContent>
                 <w:r>
                   <w:rPr>
@@ -5931,13 +5982,14 @@
             </w:pPr>
             <w:sdt>
               <w:sdtPr>
-                <w:id w:val="219100708"/>
+                <w:id w:val="-96792919"/>
                 <w14:checkbox>
                   <w14:checked w14:val="0"/>
                   <w14:checkedState w14:val="00FE" w14:font="Wingdings"/>
                   <w14:uncheckedState w14:val="2610" w14:font="MS Gothic"/>
                 </w14:checkbox>
               </w:sdtPr>
+              <w:sdtEndPr/>
               <w:sdtContent>
                 <w:r>
                   <w:rPr>
@@ -5961,6 +6013,7 @@
             <w:tcBorders>
               <w:top w:val="single" w:sz="4" w:space="0" w:color="auto"/>
               <w:left w:val="nil"/>
+              <w:bottom w:val="single" w:sz="4" w:space="0" w:color="auto"/>
             </w:tcBorders>
             <w:vAlign w:val="center"/>
           </w:tcPr>
@@ -5974,6 +6027,220 @@
               </w:rPr>
             </w:pPr>
           </w:p>
+        </w:tc>
+        <w:tc>
+          <w:tcPr>
+            <w:tcW w:w="1276" w:type="dxa"/>
+            <w:tcBorders>
+              <w:top w:val="single" w:sz="4" w:space="0" w:color="auto"/>
+              <w:bottom w:val="single" w:sz="4" w:space="0" w:color="auto"/>
+              <w:right w:val="single" w:sz="4" w:space="0" w:color="auto"/>
+            </w:tcBorders>
+            <w:vAlign w:val="center"/>
+          </w:tcPr>
+          <w:p>
+            <w:pPr>
+              <w:pStyle w:val="TableParagraph"/>
+              <w:tabs>
+                <w:tab w:val="left" w:pos="1730"/>
+                <w:tab w:val="left" w:pos="2863"/>
+              </w:tabs>
+              <w:spacing w:line="215" w:lineRule="exact"/>
+              <w:jc w:val="center"/>
+            </w:pPr>
+            <w:sdt>
+              <w:sdtPr>
+                <w:id w:val="-1185359554"/>
+                <w14:checkbox>
+                  <w14:checked w14:val="0"/>
+                  <w14:checkedState w14:val="00FE" w14:font="Wingdings"/>
+                  <w14:uncheckedState w14:val="2610" w14:font="MS Gothic"/>
+                </w14:checkbox>
+              </w:sdtPr>
+              <w:sdtEndPr/>
+              <w:sdtContent>
+                <w:r>
+                  <w:rPr>
+                    <w:rFonts w:ascii="MS Gothic" w:eastAsia="MS Gothic" w:hAnsi="MS Gothic" w:hint="eastAsia"/>
+                  </w:rPr>
+                  <w:t>☐</w:t>
+                </w:r>
+              </w:sdtContent>
+            </w:sdt>
+          </w:p>
+        </w:tc>
+        <w:tc>
+          <w:tcPr>
+            <w:tcW w:w="1417" w:type="dxa"/>
+            <w:tcBorders>
+              <w:top w:val="single" w:sz="4" w:space="0" w:color="auto"/>
+              <w:left w:val="single" w:sz="4" w:space="0" w:color="auto"/>
+              <w:bottom w:val="single" w:sz="4" w:space="0" w:color="auto"/>
+              <w:right w:val="single" w:sz="4" w:space="0" w:color="auto"/>
+            </w:tcBorders>
+            <w:vAlign w:val="center"/>
+          </w:tcPr>
+          <w:p>
+            <w:pPr>
+              <w:pStyle w:val="TableParagraph"/>
+              <w:tabs>
+                <w:tab w:val="left" w:pos="1730"/>
+                <w:tab w:val="left" w:pos="2863"/>
+              </w:tabs>
+              <w:spacing w:line="215" w:lineRule="exact"/>
+              <w:jc w:val="center"/>
+            </w:pPr>
+            <w:sdt>
+              <w:sdtPr>
+                <w:id w:val="988444130"/>
+                <w14:checkbox>
+                  <w14:checked w14:val="0"/>
+                  <w14:checkedState w14:val="00FE" w14:font="Wingdings"/>
+                  <w14:uncheckedState w14:val="2610" w14:font="MS Gothic"/>
+                </w14:checkbox>
+              </w:sdtPr>
+              <w:sdtEndPr/>
+              <w:sdtContent>
+                <w:r>
+                  <w:rPr>
+                    <w:rFonts w:ascii="MS Gothic" w:eastAsia="MS Gothic" w:hAnsi="MS Gothic" w:hint="eastAsia"/>
+                  </w:rPr>
+                  <w:t>☐</w:t>
+                </w:r>
+              </w:sdtContent>
+            </w:sdt>
+          </w:p>
+        </w:tc>
+        <w:tc>
+          <w:tcPr>
+            <w:tcW w:w="1701" w:type="dxa"/>
+            <w:tcBorders>
+              <w:top w:val="single" w:sz="4" w:space="0" w:color="auto"/>
+              <w:left w:val="single" w:sz="4" w:space="0" w:color="auto"/>
+              <w:bottom w:val="single" w:sz="4" w:space="0" w:color="auto"/>
+              <w:right w:val="single" w:sz="4" w:space="0" w:color="auto"/>
+            </w:tcBorders>
+            <w:vAlign w:val="center"/>
+          </w:tcPr>
+          <w:p>
+            <w:pPr>
+              <w:pStyle w:val="TableParagraph"/>
+              <w:tabs>
+                <w:tab w:val="left" w:pos="1730"/>
+                <w:tab w:val="left" w:pos="2863"/>
+              </w:tabs>
+              <w:spacing w:line="215" w:lineRule="exact"/>
+              <w:jc w:val="center"/>
+            </w:pPr>
+            <w:sdt>
+              <w:sdtPr>
+                <w:id w:val="219100708"/>
+                <w14:checkbox>
+                  <w14:checked w14:val="0"/>
+                  <w14:checkedState w14:val="00FE" w14:font="Wingdings"/>
+                  <w14:uncheckedState w14:val="2610" w14:font="MS Gothic"/>
+                </w14:checkbox>
+              </w:sdtPr>
+              <w:sdtEndPr/>
+              <w:sdtContent>
+                <w:r>
+                  <w:rPr>
+                    <w:rFonts w:ascii="MS Gothic" w:eastAsia="MS Gothic" w:hAnsi="MS Gothic" w:hint="eastAsia"/>
+                  </w:rPr>
+                  <w:t>☐</w:t>
+                </w:r>
+              </w:sdtContent>
+            </w:sdt>
+          </w:p>
+        </w:tc>
+      </w:tr>
+      <w:tr>
+        <w:trPr>
+          <w:trHeight w:val="232"/>
+        </w:trPr>
+        <w:tc>
+          <w:tcPr>
+            <w:tcW w:w="6001" w:type="dxa"/>
+            <w:gridSpan w:val="2"/>
+            <w:tcBorders>
+              <w:top w:val="single" w:sz="4" w:space="0" w:color="auto"/>
+              <w:left w:val="nil"/>
+            </w:tcBorders>
+            <w:vAlign w:val="center"/>
+          </w:tcPr>
+          <w:sdt>
+            <w:sdtPr>
+              <w:rPr>
+                <w:rFonts w:ascii="Times New Roman"/>
+                <w:sz w:val="20"/>
+                <w:szCs w:val="20"/>
+              </w:rPr>
+              <w:alias w:val="Unit List"/>
+              <w:tag w:val="Unit List"/>
+              <w:id w:val="9507480"/>
+              <w:placeholder>
+                <w:docPart w:val="20C903A35C194B90AEF179D16814BFA9"/>
+              </w:placeholder>
+              <w:showingPlcHdr/>
+              <w:dropDownList>
+                <w:listItem w:value="Choose an item."/>
+                <w:listItem w:displayText="CPCCCA2002 Use carpentry tools and equipment" w:value="CPCCCA2002 Use carpentry tools and equipment"/>
+                <w:listItem w:displayText="CPCCCA2011 Handle carpentry materials" w:value="CPCCCA2011 Handle carpentry materials"/>
+                <w:listItem w:displayText="CPCCCA3001 Carry out general demolition of minor building structures" w:value="CPCCCA3001 Carry out general demolition of minor building structures"/>
+                <w:listItem w:displayText="CPCCCA3002 Carry out setting out" w:value="CPCCCA3002 Carry out setting out"/>
+                <w:listItem w:displayText="CPCCCA3003 Install flooring systems" w:value="CPCCCA3003 Install flooring systems"/>
+                <w:listItem w:displayText="CPCCCA3004 Construct and erect wall frames" w:value="CPCCCA3004 Construct and erect wall frames"/>
+                <w:listItem w:displayText="CPCCCA3005 Construct ceiling frames" w:value="CPCCCA3005 Construct ceiling frames"/>
+                <w:listItem w:displayText="CPCCCA3006 Erect roof trusses" w:value="CPCCCA3006 Erect roof trusses"/>
+                <w:listItem w:displayText="CPCCCA3007 Construct pitched roofs" w:value="CPCCCA3007 Construct pitched roofs"/>
+                <w:listItem w:displayText="CPCCCA3008 Construct eaves" w:value="CPCCCA3008 Construct eaves"/>
+                <w:listItem w:displayText="CPCCCA3010 Install windows and doors" w:value="CPCCCA3010 Install windows and doors"/>
+                <w:listItem w:displayText="CPCCCA3016 Construct, assemble and install timber external stairs" w:value="CPCCCA3016 Construct, assemble and install timber external stairs"/>
+                <w:listItem w:displayText="CPCCCA3017 Install exterior cladding" w:value="CPCCCA3017 Install exterior cladding"/>
+                <w:listItem w:displayText="CPCCCA3024 Install lining, panelling and moulding" w:value="CPCCCA3024 Install lining, panelling and moulding"/>
+                <w:listItem w:displayText="CPCCCA3025 Read and interpret plans, specifications and drawings for carpentry work" w:value="CPCCCA3025 Read and interpret plans, specifications and drawings for carpentry work"/>
+                <w:listItem w:displayText="CPCCCA3028 Erect and dismantle formwork for footings and slabs on ground" w:value="CPCCCA3028 Erect and dismantle formwork for footings and slabs on ground"/>
+                <w:listItem w:displayText="CPCCCM2006 Apply basic levelling procedures" w:value="CPCCCM2006 Apply basic levelling procedures"/>
+                <w:listItem w:displayText="CPCCCM2008 Erect and dismantle restricted height scaffolding" w:value="CPCCCM2008 Erect and dismantle restricted height scaffolding"/>
+                <w:listItem w:displayText="CPCCCM2012 Work safely at heights" w:value="CPCCCM2012 Work safely at heights"/>
+                <w:listItem w:displayText="CPCCCO2013 Carry out concreting to simple forms" w:value="CPCCCO2013 Carry out concreting to simple forms"/>
+                <w:listItem w:displayText="CPCCOM1012 Work effectively and sustainably in the construction industry" w:value="CPCCOM1012 Work effectively and sustainably in the construction industry"/>
+                <w:listItem w:displayText="CPCCOM1014 Conduct workplace communication" w:value="CPCCOM1014 Conduct workplace communication"/>
+                <w:listItem w:displayText="CPCCOM1015 Carry out measurements and calculations" w:value="CPCCOM1015 Carry out measurements and calculations"/>
+                <w:listItem w:displayText="CPCCOM3001 Perform construction calculations to determine carpentry material requirements" w:value="CPCCOM3001 Perform construction calculations to determine carpentry material requirements"/>
+                <w:listItem w:displayText="CPCCOM3006 Carry out levelling operations" w:value="CPCCOM3006 Carry out levelling operations"/>
+                <w:listItem w:displayText="CPCCWHS2001 Apply WHS requirements, policies and procedures in the construction industry" w:value="CPCCWHS2001 Apply WHS requirements, policies and procedures in the construction industry"/>
+                <w:listItem w:displayText="CPCWHS3001 Identify construction work hazards and select risk control strategies" w:value="CPCWHS3001 Identify construction work hazards and select risk control strategies"/>
+                <w:listItem w:displayText="CPCCCM2002 Carry out hand excavation" w:value="CPCCCM2002 Carry out hand excavation"/>
+                <w:listItem w:displayText="CPCCCA3012 Frame and fit wet area fixtures" w:value="CPCCCA3012 Frame and fit wet area fixtures"/>
+                <w:listItem w:displayText="CPCCCA3014 Construct and install bulkheads" w:value="CPCCCA3014 Construct and install bulkheads"/>
+                <w:listItem w:displayText="CPCCSF2004 Place and fix reinforcement materials" w:value="CPCCSF2004 Place and fix reinforcement materials"/>
+                <w:listItem w:displayText="CPCCCA3018 Construct, erect and dismantle formwork for stairs and ramps" w:value="CPCCCA3018 Construct, erect and dismantle formwork for stairs and ramps"/>
+                <w:listItem w:displayText="CPCCBC4014 Prepare simple building sketches and drawings" w:value="CPCCBC4014 Prepare simple building sketches and drawings"/>
+                <w:listItem w:displayText="CPCCBC4004 Identify and produce estimated costs for building and construction projects" w:value="CPCCBC4004 Identify and produce estimated costs for building and construction projects"/>
+                <w:listItem w:displayText="CPCCWHS1001 Prepare to work safely in the construction industry" w:value="CPCCWHS1001 Prepare to work safely in the construction industry"/>
+              </w:dropDownList>
+            </w:sdtPr>
+            <w:sdtEndPr/>
+            <w:sdtContent>
+              <w:p>
+                <w:pPr>
+                  <w:pStyle w:val="TableParagraph"/>
+                  <w:rPr>
+                    <w:rFonts w:ascii="Times New Roman"/>
+                    <w:sz w:val="20"/>
+                    <w:szCs w:val="20"/>
+                  </w:rPr>
+                </w:pPr>
+                <w:r>
+                  <w:rPr>
+                    <w:rStyle w:val="PlaceholderText"/>
+                  </w:rPr>
+                  <w:t>Choose an item.</w:t>
+                </w:r>
+              </w:p>
+            </w:sdtContent>
+          </w:sdt>
         </w:tc>
         <w:tc>
           <w:tcPr>
@@ -6003,6 +6270,7 @@
                   <w14:uncheckedState w14:val="2610" w14:font="MS Gothic"/>
                 </w14:checkbox>
               </w:sdtPr>
+              <w:sdtEndPr/>
               <w:sdtContent>
                 <w:r>
                   <w:rPr>
@@ -6043,6 +6311,7 @@
                   <w14:uncheckedState w14:val="2610" w14:font="MS Gothic"/>
                 </w14:checkbox>
               </w:sdtPr>
+              <w:sdtEndPr/>
               <w:sdtContent>
                 <w:r>
                   <w:rPr>
@@ -6083,6 +6352,7 @@
                   <w14:uncheckedState w14:val="2610" w14:font="MS Gothic"/>
                 </w14:checkbox>
               </w:sdtPr>
+              <w:sdtEndPr/>
               <w:sdtContent>
                 <w:r>
                   <w:rPr>
@@ -6368,6 +6638,7 @@
                 <w:listItem w:displayText="CPCCWHS1001 Prepare to work safely in the construction industry" w:value="CPCCWHS1001 Prepare to work safely in the construction industry"/>
               </w:dropDownList>
             </w:sdtPr>
+            <w:sdtEndPr/>
             <w:sdtContent>
               <w:p>
                 <w:pPr>
@@ -6420,6 +6691,7 @@
                   <w14:uncheckedState w14:val="2610" w14:font="MS Gothic"/>
                 </w14:checkbox>
               </w:sdtPr>
+              <w:sdtEndPr/>
               <w:sdtContent>
                 <w:r>
                   <w:rPr>
@@ -6517,6 +6789,7 @@
                 <w:listItem w:displayText="CPCCWHS1001 Prepare to work safely in the construction industry" w:value="CPCCWHS1001 Prepare to work safely in the construction industry"/>
               </w:dropDownList>
             </w:sdtPr>
+            <w:sdtEndPr/>
             <w:sdtContent>
               <w:p>
                 <w:pPr>
@@ -6566,6 +6839,7 @@
                   <w14:uncheckedState w14:val="2610" w14:font="MS Gothic"/>
                 </w14:checkbox>
               </w:sdtPr>
+              <w:sdtEndPr/>
               <w:sdtContent>
                 <w:r>
                   <w:rPr>
@@ -6663,6 +6937,7 @@
                 <w:listItem w:displayText="CPCCWHS1001 Prepare to work safely in the construction industry" w:value="CPCCWHS1001 Prepare to work safely in the construction industry"/>
               </w:dropDownList>
             </w:sdtPr>
+            <w:sdtEndPr/>
             <w:sdtContent>
               <w:p>
                 <w:pPr>
@@ -6712,6 +6987,7 @@
                   <w14:uncheckedState w14:val="2610" w14:font="MS Gothic"/>
                 </w14:checkbox>
               </w:sdtPr>
+              <w:sdtEndPr/>
               <w:sdtContent>
                 <w:r>
                   <w:rPr>
@@ -6809,6 +7085,7 @@
                 <w:listItem w:displayText="CPCCWHS1001 Prepare to work safely in the construction industry" w:value="CPCCWHS1001 Prepare to work safely in the construction industry"/>
               </w:dropDownList>
             </w:sdtPr>
+            <w:sdtEndPr/>
             <w:sdtContent>
               <w:p>
                 <w:pPr>
@@ -6858,6 +7135,7 @@
                   <w14:uncheckedState w14:val="2610" w14:font="MS Gothic"/>
                 </w14:checkbox>
               </w:sdtPr>
+              <w:sdtEndPr/>
               <w:sdtContent>
                 <w:r>
                   <w:rPr>
@@ -6954,6 +7232,7 @@
                 <w:listItem w:displayText="CPCCWHS1001 Prepare to work safely in the construction industry" w:value="CPCCWHS1001 Prepare to work safely in the construction industry"/>
               </w:dropDownList>
             </w:sdtPr>
+            <w:sdtEndPr/>
             <w:sdtContent>
               <w:p>
                 <w:pPr>
@@ -7002,6 +7281,7 @@
                   <w14:uncheckedState w14:val="2610" w14:font="MS Gothic"/>
                 </w14:checkbox>
               </w:sdtPr>
+              <w:sdtEndPr/>
               <w:sdtContent>
                 <w:r>
                   <w:rPr>
@@ -7155,6 +7435,7 @@
                 <w:listItem w:displayText="No" w:value="No"/>
               </w:comboBox>
             </w:sdtPr>
+            <w:sdtEndPr/>
             <w:sdtContent>
               <w:p>
                 <w:pPr>
@@ -7377,6 +7658,7 @@
                 <w:listItem w:displayText="No" w:value="No"/>
               </w:comboBox>
             </w:sdtPr>
+            <w:sdtEndPr/>
             <w:sdtContent>
               <w:p>
                 <w:pPr>
@@ -7560,6 +7842,7 @@
                 <w:listItem w:displayText="No" w:value="No"/>
               </w:comboBox>
             </w:sdtPr>
+            <w:sdtEndPr/>
             <w:sdtContent>
               <w:p>
                 <w:pPr>
@@ -8130,6 +8413,7 @@
                         <w:listItem w:displayText="Practical skill assessment/s were completed by the student with practical assessment tasks specifically related to the open Unit/Units of Competency" w:value="Practical skill assessment/s were completed by the student with practical assessment tasks specifically related to the open Unit/Units of Competency"/>
                       </w:comboBox>
                     </w:sdtPr>
+                    <w:sdtEndPr/>
                     <w:sdtContent>
                       <w:r>
                         <w:rPr>
@@ -8168,6 +8452,7 @@
                         <w:listItem w:displayText="Practical skill assessment/s were completed by the student with practical assessment tasks specifically related to the open Unit/Units of Competency" w:value="Practical skill assessment/s were completed by the student with practical assessment tasks specifically related to the open Unit/Units of Competency"/>
                       </w:comboBox>
                     </w:sdtPr>
+                    <w:sdtEndPr/>
                     <w:sdtContent>
                       <w:r>
                         <w:rPr>
@@ -8206,6 +8491,7 @@
                         <w:listItem w:displayText="Practical skill assessment/s were completed by the student with practical assessment tasks specifically related to the open Unit/Units of Competency" w:value="Practical skill assessment/s were completed by the student with practical assessment tasks specifically related to the open Unit/Units of Competency"/>
                       </w:comboBox>
                     </w:sdtPr>
+                    <w:sdtEndPr/>
                     <w:sdtContent>
                       <w:r>
                         <w:rPr>
@@ -8244,6 +8530,7 @@
                         <w:listItem w:displayText="Practical skill assessment/s were completed by the student with practical assessment tasks specifically related to the open Unit/Units of Competency" w:value="Practical skill assessment/s were completed by the student with practical assessment tasks specifically related to the open Unit/Units of Competency"/>
                       </w:comboBox>
                     </w:sdtPr>
+                    <w:sdtEndPr/>
                     <w:sdtContent>
                       <w:r>
                         <w:rPr>
@@ -8282,6 +8569,7 @@
                         <w:listItem w:displayText="Practical skill assessment/s were completed by the student with practical assessment tasks specifically related to the open Unit/Units of Competency" w:value="Practical skill assessment/s were completed by the student with practical assessment tasks specifically related to the open Unit/Units of Competency"/>
                       </w:comboBox>
                     </w:sdtPr>
+                    <w:sdtEndPr/>
                     <w:sdtContent>
                       <w:r>
                         <w:rPr>
@@ -8451,6 +8739,7 @@
                         <w:listItem w:displayText="Covering Relevant Topics: During this discussion, we addressed all relevant topics related to the assessments and made sure to respond to any questions or concerns the student had regarding the content and their academic progress." w:value="Covering Relevant Topics: During this discussion, we addressed all relevant topics related to the assessments and made sure to respond to any questions or concerns the student had regarding the content and their academic progress."/>
                       </w:comboBox>
                     </w:sdtPr>
+                    <w:sdtEndPr/>
                     <w:sdtContent>
                       <w:r>
                         <w:rPr>
@@ -8486,6 +8775,7 @@
                         <w:listItem w:displayText="Covering Relevant Topics: During this discussion, we addressed all relevant topics related to the assessments and made sure to respond to any questions or concerns the student had regarding the content and their academic progress." w:value="Covering Relevant Topics: During this discussion, we addressed all relevant topics related to the assessments and made sure to respond to any questions or concerns the student had regarding the content and their academic progress."/>
                       </w:comboBox>
                     </w:sdtPr>
+                    <w:sdtEndPr/>
                     <w:sdtContent>
                       <w:r>
                         <w:rPr>
@@ -8661,6 +8951,7 @@
                         <w:listItem w:displayText="What resources or references should I use for this assessment? Students asked for guidance on recommended readings, textbooks, or sources they should consult while working on their assessment." w:value="What resources or references should I use for this assessment? Students asked for guidance on recommended readings, textbooks, or sources they should consult while working on their assessment."/>
                       </w:comboBox>
                     </w:sdtPr>
+                    <w:sdtEndPr/>
                     <w:sdtContent>
                       <w:r>
                         <w:rPr>
@@ -8698,6 +8989,7 @@
                         <w:listItem w:displayText="What resources or references should I use for this assessment? Students asked for guidance on recommended readings, textbooks, or sources they should consult while working on their assessment." w:value="What resources or references should I use for this assessment? Students asked for guidance on recommended readings, textbooks, or sources they should consult while working on their assessment."/>
                       </w:comboBox>
                     </w:sdtPr>
+                    <w:sdtEndPr/>
                     <w:sdtContent>
                       <w:r>
                         <w:rPr>
@@ -8735,6 +9027,7 @@
                         <w:listItem w:displayText="What resources or references should I use for this assessment? Students asked for guidance on recommended readings, textbooks, or sources they should consult while working on their assessment." w:value="What resources or references should I use for this assessment? Students asked for guidance on recommended readings, textbooks, or sources they should consult while working on their assessment."/>
                       </w:comboBox>
                     </w:sdtPr>
+                    <w:sdtEndPr/>
                     <w:sdtContent>
                       <w:r>
                         <w:rPr>
@@ -8772,6 +9065,7 @@
                         <w:listItem w:displayText="What resources or references should I use for this assessment? Students asked for guidance on recommended readings, textbooks, or sources they should consult while working on their assessment." w:value="What resources or references should I use for this assessment? Students asked for guidance on recommended readings, textbooks, or sources they should consult while working on their assessment."/>
                       </w:comboBox>
                     </w:sdtPr>
+                    <w:sdtEndPr/>
                     <w:sdtContent>
                       <w:r>
                         <w:rPr>
@@ -8873,6 +9167,7 @@
                         <w:listItem w:displayText="Yes – I discussed the students’ academic progress and confirmed the workplace supervisor / employers view of the students competence in the workplace " w:value="Yes – I discussed the students’ academic progress and confirmed the workplace supervisor / employers view of the students competence in the workplace "/>
                       </w:comboBox>
                     </w:sdtPr>
+                    <w:sdtEndPr/>
                     <w:sdtContent>
                       <w:r>
                         <w:rPr>
@@ -8909,6 +9204,7 @@
                         <w:listItem w:displayText="Yes – I discussed the students’ academic progress and confirmed the workplace supervisor / employers view of the students competence in the workplace " w:value="Yes – I discussed the students’ academic progress and confirmed the workplace supervisor / employers view of the students competence in the workplace "/>
                       </w:comboBox>
                     </w:sdtPr>
+                    <w:sdtEndPr/>
                     <w:sdtContent>
                       <w:r>
                         <w:rPr>
@@ -9146,6 +9442,7 @@
               <w:calendar w:val="gregorian"/>
             </w:date>
           </w:sdtPr>
+          <w:sdtEndPr/>
           <w:sdtContent>
             <w:tc>
               <w:tcPr>
@@ -10059,6 +10356,7 @@
               <w:calendar w:val="gregorian"/>
             </w:date>
           </w:sdtPr>
+          <w:sdtEndPr/>
           <w:sdtContent>
             <w:tc>
               <w:tcPr>
@@ -10389,6 +10687,7 @@
               <w:calendar w:val="gregorian"/>
             </w:date>
           </w:sdtPr>
+          <w:sdtEndPr/>
           <w:sdtContent>
             <w:tc>
               <w:tcPr>
@@ -10805,6 +11104,7 @@
               <w:calendar w:val="gregorian"/>
             </w:date>
           </w:sdtPr>
+          <w:sdtEndPr/>
           <w:sdtContent>
             <w:tc>
               <w:tcPr>
@@ -11913,6 +12213,7 @@
               <w:calendar w:val="gregorian"/>
             </w:date>
           </w:sdtPr>
+          <w:sdtEndPr/>
           <w:sdtContent>
             <w:tc>
               <w:tcPr>
@@ -12220,23 +12521,9 @@
           <w:tcPr>
             <w:tcW w:w="9016" w:type="dxa"/>
             <w:gridSpan w:val="7"/>
-            <w:shd w:val="clear" w:color="auto" w:fill="D0CECE" w:themeFill="background2" w:themeFillShade="E6"/>
-          </w:tcPr>
-          <w:p>
-            <w:pPr>
-              <w:rPr>
-                <w:b/>
-                <w:bCs/>
-              </w:rPr>
-            </w:pPr>
-            <w:r>
-              <w:rPr>
-                <w:b/>
-                <w:bCs/>
-              </w:rPr>
-              <w:t>Routine Work Duties Engagement (Ready Skills) – Minimum of 1 MUST be chosen</w:t>
-            </w:r>
-          </w:p>
+            <w:vAlign w:val="center"/>
+          </w:tcPr>
+          <w:p/>
         </w:tc>
       </w:tr>
       <w:tr>
@@ -12244,111 +12531,81 @@
           <w:tcPr>
             <w:tcW w:w="9016" w:type="dxa"/>
             <w:gridSpan w:val="7"/>
-          </w:tcPr>
-          <w:p>
-            <w:pPr>
-              <w:rPr>
-                <w:b/>
-                <w:bCs/>
-              </w:rPr>
-            </w:pPr>
-          </w:p>
-        </w:tc>
-      </w:tr>
-      <w:tr>
-        <w:tc>
-          <w:tcPr>
-            <w:tcW w:w="9016" w:type="dxa"/>
-            <w:gridSpan w:val="7"/>
-          </w:tcPr>
-          <w:p>
-            <w:pPr>
-              <w:rPr>
-                <w:b/>
-                <w:bCs/>
-              </w:rPr>
-            </w:pPr>
-          </w:p>
-        </w:tc>
-      </w:tr>
-      <w:tr>
-        <w:tc>
-          <w:tcPr>
-            <w:tcW w:w="9016" w:type="dxa"/>
-            <w:gridSpan w:val="7"/>
-          </w:tcPr>
-          <w:p>
-            <w:pPr>
-              <w:rPr>
-                <w:b/>
-                <w:bCs/>
-              </w:rPr>
-            </w:pPr>
-          </w:p>
-        </w:tc>
-      </w:tr>
-      <w:tr>
-        <w:tc>
-          <w:tcPr>
-            <w:tcW w:w="9016" w:type="dxa"/>
-            <w:gridSpan w:val="7"/>
-          </w:tcPr>
-          <w:p>
-            <w:pPr>
-              <w:rPr>
-                <w:b/>
-                <w:bCs/>
-              </w:rPr>
-            </w:pPr>
-          </w:p>
-        </w:tc>
-      </w:tr>
-      <w:tr>
-        <w:tc>
-          <w:tcPr>
-            <w:tcW w:w="9016" w:type="dxa"/>
-            <w:gridSpan w:val="7"/>
-          </w:tcPr>
-          <w:p>
-            <w:pPr>
-              <w:rPr>
-                <w:b/>
-                <w:bCs/>
-              </w:rPr>
-            </w:pPr>
-          </w:p>
-        </w:tc>
-      </w:tr>
-      <w:tr>
-        <w:tc>
-          <w:tcPr>
-            <w:tcW w:w="9016" w:type="dxa"/>
-            <w:gridSpan w:val="7"/>
-          </w:tcPr>
-          <w:p>
-            <w:pPr>
-              <w:rPr>
-                <w:b/>
-                <w:bCs/>
-              </w:rPr>
-            </w:pPr>
-          </w:p>
-        </w:tc>
-      </w:tr>
-      <w:tr>
-        <w:tc>
-          <w:tcPr>
-            <w:tcW w:w="9016" w:type="dxa"/>
-            <w:gridSpan w:val="7"/>
-          </w:tcPr>
-          <w:p>
-            <w:pPr>
-              <w:rPr>
-                <w:b/>
-                <w:bCs/>
-              </w:rPr>
-            </w:pPr>
-          </w:p>
+            <w:vAlign w:val="center"/>
+          </w:tcPr>
+          <w:sdt>
+            <w:sdtPr>
+              <w:rPr>
+                <w:rFonts w:ascii="Times New Roman"/>
+                <w:sz w:val="20"/>
+                <w:szCs w:val="20"/>
+              </w:rPr>
+              <w:alias w:val="Unit List"/>
+              <w:tag w:val="Unit List"/>
+              <w:id w:val="-1627081941"/>
+              <w:placeholder>
+                <w:docPart w:val="8C2F36A8D6FD4861BA6B88F9D097A3A3"/>
+              </w:placeholder>
+              <w:showingPlcHdr/>
+              <w:dropDownList>
+                <w:listItem w:value="Choose an item."/>
+                <w:listItem w:displayText="CPCCCA2002 Use carpentry tools and equipment" w:value="CPCCCA2002 Use carpentry tools and equipment"/>
+                <w:listItem w:displayText="CPCCCA2011 Handle carpentry materials" w:value="CPCCCA2011 Handle carpentry materials"/>
+                <w:listItem w:displayText="CPCCCA3001 Carry out general demolition of minor building structures" w:value="CPCCCA3001 Carry out general demolition of minor building structures"/>
+                <w:listItem w:displayText="CPCCCA3002 Carry out setting out" w:value="CPCCCA3002 Carry out setting out"/>
+                <w:listItem w:displayText="CPCCCA3003 Install flooring systems" w:value="CPCCCA3003 Install flooring systems"/>
+                <w:listItem w:displayText="CPCCCA3004 Construct and erect wall frames" w:value="CPCCCA3004 Construct and erect wall frames"/>
+                <w:listItem w:displayText="CPCCCA3005 Construct ceiling frames" w:value="CPCCCA3005 Construct ceiling frames"/>
+                <w:listItem w:displayText="CPCCCA3006 Erect roof trusses" w:value="CPCCCA3006 Erect roof trusses"/>
+                <w:listItem w:displayText="CPCCCA3007 Construct pitched roofs" w:value="CPCCCA3007 Construct pitched roofs"/>
+                <w:listItem w:displayText="CPCCCA3008 Construct eaves" w:value="CPCCCA3008 Construct eaves"/>
+                <w:listItem w:displayText="CPCCCA3010 Install windows and doors" w:value="CPCCCA3010 Install windows and doors"/>
+                <w:listItem w:displayText="CPCCCA3016 Construct, assemble and install timber external stairs" w:value="CPCCCA3016 Construct, assemble and install timber external stairs"/>
+                <w:listItem w:displayText="CPCCCA3017 Install exterior cladding" w:value="CPCCCA3017 Install exterior cladding"/>
+                <w:listItem w:displayText="CPCCCA3024 Install lining, panelling and moulding" w:value="CPCCCA3024 Install lining, panelling and moulding"/>
+                <w:listItem w:displayText="CPCCCA3025 Read and interpret plans, specifications and drawings for carpentry work" w:value="CPCCCA3025 Read and interpret plans, specifications and drawings for carpentry work"/>
+                <w:listItem w:displayText="CPCCCA3028 Erect and dismantle formwork for footings and slabs on ground" w:value="CPCCCA3028 Erect and dismantle formwork for footings and slabs on ground"/>
+                <w:listItem w:displayText="CPCCCM2006 Apply basic levelling procedures" w:value="CPCCCM2006 Apply basic levelling procedures"/>
+                <w:listItem w:displayText="CPCCCM2008 Erect and dismantle restricted height scaffolding" w:value="CPCCCM2008 Erect and dismantle restricted height scaffolding"/>
+                <w:listItem w:displayText="CPCCCM2012 Work safely at heights" w:value="CPCCCM2012 Work safely at heights"/>
+                <w:listItem w:displayText="CPCCCO2013 Carry out concreting to simple forms" w:value="CPCCCO2013 Carry out concreting to simple forms"/>
+                <w:listItem w:displayText="CPCCOM1012 Work effectively and sustainably in the construction industry" w:value="CPCCOM1012 Work effectively and sustainably in the construction industry"/>
+                <w:listItem w:displayText="CPCCOM1014 Conduct workplace communication" w:value="CPCCOM1014 Conduct workplace communication"/>
+                <w:listItem w:displayText="CPCCOM1015 Carry out measurements and calculations" w:value="CPCCOM1015 Carry out measurements and calculations"/>
+                <w:listItem w:displayText="CPCCOM3001 Perform construction calculations to determine carpentry material requirements" w:value="CPCCOM3001 Perform construction calculations to determine carpentry material requirements"/>
+                <w:listItem w:displayText="CPCCOM3006 Carry out levelling operations" w:value="CPCCOM3006 Carry out levelling operations"/>
+                <w:listItem w:displayText="CPCCWHS2001 Apply WHS requirements, policies and procedures in the construction industry" w:value="CPCCWHS2001 Apply WHS requirements, policies and procedures in the construction industry"/>
+                <w:listItem w:displayText="CPCWHS3001 Identify construction work hazards and select risk control strategies" w:value="CPCWHS3001 Identify construction work hazards and select risk control strategies"/>
+                <w:listItem w:displayText="CPCCCM2002 Carry out hand excavation" w:value="CPCCCM2002 Carry out hand excavation"/>
+                <w:listItem w:displayText="CPCCCA3012 Frame and fit wet area fixtures" w:value="CPCCCA3012 Frame and fit wet area fixtures"/>
+                <w:listItem w:displayText="CPCCCA3014 Construct and install bulkheads" w:value="CPCCCA3014 Construct and install bulkheads"/>
+                <w:listItem w:displayText="CPCCSF2004 Place and fix reinforcement materials" w:value="CPCCSF2004 Place and fix reinforcement materials"/>
+                <w:listItem w:displayText="CPCCCA3018 Construct, erect and dismantle formwork for stairs and ramps" w:value="CPCCCA3018 Construct, erect and dismantle formwork for stairs and ramps"/>
+                <w:listItem w:displayText="CPCCBC4014 Prepare simple building sketches and drawings" w:value="CPCCBC4014 Prepare simple building sketches and drawings"/>
+                <w:listItem w:displayText="CPCCBC4004 Identify and produce estimated costs for building and construction projects" w:value="CPCCBC4004 Identify and produce estimated costs for building and construction projects"/>
+                <w:listItem w:displayText="CPCCWHS1001 Prepare to work safely in the construction industry" w:value="CPCCWHS1001 Prepare to work safely in the construction industry"/>
+              </w:dropDownList>
+            </w:sdtPr>
+            <w:sdtEndPr/>
+            <w:sdtContent>
+              <w:p>
+                <w:pPr>
+                  <w:pStyle w:val="TableParagraph"/>
+                  <w:rPr>
+                    <w:rFonts w:ascii="Times New Roman"/>
+                    <w:sz w:val="20"/>
+                    <w:szCs w:val="20"/>
+                  </w:rPr>
+                </w:pPr>
+                <w:r>
+                  <w:rPr>
+                    <w:rStyle w:val="PlaceholderText"/>
+                  </w:rPr>
+                  <w:t>Choose an item.</w:t>
+                </w:r>
+              </w:p>
+            </w:sdtContent>
+          </w:sdt>
         </w:tc>
       </w:tr>
       <w:tr>
@@ -12370,7 +12627,7 @@
                 <w:b/>
                 <w:bCs/>
               </w:rPr>
-              <w:t>Terms and Conditions</w:t>
+              <w:t>Routine Work Duties Engagement (Ready Skills) – Minimum of 1 MUST be chosen</w:t>
             </w:r>
           </w:p>
         </w:tc>
@@ -12386,78 +12643,347 @@
               <w:rPr>
                 <w:b/>
                 <w:bCs/>
-                <w:u w:val="single"/>
-              </w:rPr>
-            </w:pPr>
-            <w:r>
+              </w:rPr>
+            </w:pPr>
+          </w:p>
+        </w:tc>
+      </w:tr>
+      <w:tr>
+        <w:tc>
+          <w:tcPr>
+            <w:tcW w:w="9016" w:type="dxa"/>
+            <w:gridSpan w:val="7"/>
+          </w:tcPr>
+          <w:p>
+            <w:pPr>
+              <w:rPr>
+                <w:b/>
+                <w:bCs/>
+              </w:rPr>
+            </w:pPr>
+          </w:p>
+        </w:tc>
+      </w:tr>
+      <w:tr>
+        <w:tc>
+          <w:tcPr>
+            <w:tcW w:w="9016" w:type="dxa"/>
+            <w:gridSpan w:val="7"/>
+          </w:tcPr>
+          <w:p>
+            <w:pPr>
+              <w:rPr>
+                <w:b/>
+                <w:bCs/>
+              </w:rPr>
+            </w:pPr>
+          </w:p>
+        </w:tc>
+      </w:tr>
+      <w:tr>
+        <w:tc>
+          <w:tcPr>
+            <w:tcW w:w="9016" w:type="dxa"/>
+            <w:gridSpan w:val="7"/>
+          </w:tcPr>
+          <w:p>
+            <w:pPr>
+              <w:rPr>
+                <w:b/>
+                <w:bCs/>
+              </w:rPr>
+            </w:pPr>
+          </w:p>
+        </w:tc>
+      </w:tr>
+      <w:tr>
+        <w:tc>
+          <w:tcPr>
+            <w:tcW w:w="9016" w:type="dxa"/>
+            <w:gridSpan w:val="7"/>
+          </w:tcPr>
+          <w:p>
+            <w:pPr>
+              <w:rPr>
+                <w:b/>
+                <w:bCs/>
+              </w:rPr>
+            </w:pPr>
+          </w:p>
+        </w:tc>
+      </w:tr>
+      <w:tr>
+        <w:tc>
+          <w:tcPr>
+            <w:tcW w:w="9016" w:type="dxa"/>
+            <w:gridSpan w:val="7"/>
+          </w:tcPr>
+          <w:p>
+            <w:pPr>
+              <w:rPr>
+                <w:b/>
+                <w:bCs/>
+              </w:rPr>
+            </w:pPr>
+          </w:p>
+        </w:tc>
+      </w:tr>
+      <w:tr>
+        <w:tc>
+          <w:tcPr>
+            <w:tcW w:w="9016" w:type="dxa"/>
+            <w:gridSpan w:val="7"/>
+          </w:tcPr>
+          <w:p>
+            <w:pPr>
+              <w:rPr>
+                <w:b/>
+                <w:bCs/>
+              </w:rPr>
+            </w:pPr>
+          </w:p>
+        </w:tc>
+      </w:tr>
+      <w:tr>
+        <w:tc>
+          <w:tcPr>
+            <w:tcW w:w="9016" w:type="dxa"/>
+            <w:gridSpan w:val="7"/>
+          </w:tcPr>
+          <w:p>
+            <w:pPr>
+              <w:rPr>
+                <w:b/>
+                <w:bCs/>
+              </w:rPr>
+            </w:pPr>
+          </w:p>
+        </w:tc>
+      </w:tr>
+      <w:tr>
+        <w:tc>
+          <w:tcPr>
+            <w:tcW w:w="9016" w:type="dxa"/>
+            <w:gridSpan w:val="7"/>
+          </w:tcPr>
+          <w:sdt>
+            <w:sdtPr>
+              <w:rPr>
+                <w:rStyle w:val="PlaceholderText"/>
+              </w:rPr>
+              <w:alias w:val="Choose an item"/>
+              <w:id w:val="-1790033470"/>
+              <w:placeholder>
+                <w:docPart w:val="6D55CB894E20488784FE6C525AF37AB7"/>
+              </w:placeholder>
+              <w:dropDownList>
+                <w:listItem w:displayText="Choose an item" w:value="Choose an item"/>
+                <w:listItem w:displayText="Estimated cost(building and Construction)" w:value="Estimated cost(building and Construction)"/>
+                <w:listItem w:displayText="Building Science &amp; Technology" w:value="Building Science &amp; Technology"/>
+                <w:listItem w:displayText="Use carpentry tools and equipment" w:value="Use carpentry tools and equipment"/>
+                <w:listItem w:displayText="Handle carpentry materials" w:value="Handle carpentry materials"/>
+                <w:listItem w:displayText="General demolition" w:value="General demolition"/>
+                <w:listItem w:displayText="Setting out" w:value="Setting out"/>
+                <w:listItem w:displayText="Install flooring system" w:value="Install flooring system"/>
+                <w:listItem w:displayText="Construct &amp; erect wall frame" w:value="Construct &amp; erect wall frame"/>
+                <w:listItem w:displayText="Construct ceiling frames" w:value="Construct ceiling frames"/>
+                <w:listItem w:displayText="Erect roof trusses" w:value="Erect roof trusses"/>
+                <w:listItem w:displayText="Construct pitched roofs" w:value="Construct pitched roofs"/>
+                <w:listItem w:displayText="Construct leaves" w:value="Construct leaves"/>
+                <w:listItem w:displayText="Install windows and doors" w:value="Install windows and doors"/>
+                <w:listItem w:displayText="Frame and Fit Wet Area" w:value="Frame and Fit Wet Area"/>
+                <w:listItem w:displayText="Construct and install bulkheads" w:value="Construct and install bulkheads"/>
+                <w:listItem w:displayText="Construct timber external stairs" w:value="Construct timber external stairs"/>
+                <w:listItem w:displayText="Install exterior cladding" w:value="Install exterior cladding"/>
+                <w:listItem w:displayText="Formwork for Stairs &amp; Ramps" w:value="Formwork for Stairs &amp; Ramps"/>
+                <w:listItem w:displayText="Install lining, panelling and moulding" w:value="Install lining, panelling and moulding"/>
+                <w:listItem w:displayText="Read &amp; interpret plans and specifications" w:value="Read &amp; interpret plans and specifications"/>
+                <w:listItem w:displayText="Formwork" w:value="Formwork"/>
+                <w:listItem w:displayText="Carry out hand excavation" w:value="Carry out hand excavation"/>
+                <w:listItem w:displayText="Apply basic levelling procedures" w:value="Apply basic levelling procedures"/>
+                <w:listItem w:displayText="Restricted height scaffolding" w:value="Restricted height scaffolding"/>
+                <w:listItem w:displayText="Work safely at heights" w:value="Work safely at heights"/>
+                <w:listItem w:displayText="Carry out concreting to simple forms" w:value="Carry out concreting to simple forms"/>
+                <w:listItem w:displayText="Work effectively and sustainably" w:value="Work effectively and sustainably"/>
+                <w:listItem w:displayText="Conduct workplace communication" w:value="Conduct workplace communication"/>
+                <w:listItem w:displayText="Carry out measurement and calculations" w:value="Carry out measurement and calculations"/>
+                <w:listItem w:displayText="Perform calculations on materials" w:value="Perform calculations on materials"/>
+                <w:listItem w:displayText="Carry out levelling operations" w:value="Carry out levelling operations"/>
+                <w:listItem w:displayText="Place and fix reinforcement materials" w:value="Place and fix reinforcement materials"/>
+                <w:listItem w:displayText="Apply WHS requirements, policies and procedures" w:value="Apply WHS requirements, policies and procedures"/>
+                <w:listItem w:displayText="Identify work hazard/Risk control strategies" w:value="Identify work hazard/Risk control strategies"/>
+              </w:dropDownList>
+            </w:sdtPr>
+            <w:sdtEndPr>
+              <w:rPr>
+                <w:rStyle w:val="PlaceholderText"/>
+              </w:rPr>
+            </w:sdtEndPr>
+            <w:sdtContent>
+              <w:p>
+                <w:pPr>
+                  <w:rPr>
+                    <w:color w:val="808080"/>
+                  </w:rPr>
+                </w:pPr>
+                <w:r>
+                  <w:rPr>
+                    <w:rStyle w:val="PlaceholderText"/>
+                  </w:rPr>
+                  <w:t>Choose an item</w:t>
+                </w:r>
+              </w:p>
+            </w:sdtContent>
+          </w:sdt>
+        </w:tc>
+      </w:tr>
+      <w:tr>
+        <w:tc>
+          <w:tcPr>
+            <w:tcW w:w="9016" w:type="dxa"/>
+            <w:gridSpan w:val="7"/>
+            <w:shd w:val="clear" w:color="auto" w:fill="D0CECE" w:themeFill="background2" w:themeFillShade="E6"/>
+          </w:tcPr>
+          <w:p>
+            <w:pPr>
+              <w:rPr>
+                <w:b/>
+                <w:bCs/>
+              </w:rPr>
+            </w:pPr>
+            <w:r>
+              <w:rPr>
+                <w:b/>
+                <w:bCs/>
+              </w:rPr>
+              <w:t>Terms and Conditions</w:t>
+            </w:r>
+          </w:p>
+        </w:tc>
+      </w:tr>
+      <w:tr>
+        <w:tc>
+          <w:tcPr>
+            <w:tcW w:w="9016" w:type="dxa"/>
+            <w:gridSpan w:val="7"/>
+          </w:tcPr>
+          <w:p>
+            <w:pPr>
               <w:rPr>
                 <w:b/>
                 <w:bCs/>
                 <w:u w:val="single"/>
               </w:rPr>
-              <w:t>Student</w:t>
-            </w:r>
-          </w:p>
-          <w:p>
-            <w:pPr>
-              <w:rPr>
-                <w:b/>
-                <w:bCs/>
-              </w:rPr>
-            </w:pPr>
-            <w:r>
-              <w:rPr>
-                <w:b/>
-                <w:bCs/>
-              </w:rPr>
-              <w:t>I confirm that this is a representation of my signature and that I am in attendance and my Trainer/Assessor has confirmed with me that I am actively participating in training, learning and/or assessment in the units listed above with my Trainer/Assessor.</w:t>
-            </w:r>
-          </w:p>
-          <w:p/>
-          <w:p>
-            <w:r>
-              <w:t xml:space="preserve">I also confirm that where I have been deemed eligible under the Victorian Skills First Program for Government Subsidised training. I am residing in Victoria whilst studying this qualification and that I am physically present in Victoria at this time.   </w:t>
-            </w:r>
-          </w:p>
-          <w:p>
-            <w:r>
-              <w:t>or</w:t>
-            </w:r>
-          </w:p>
-          <w:p>
-            <w:r>
-              <w:t xml:space="preserve">I am a full </w:t>
-            </w:r>
-            <w:proofErr w:type="gramStart"/>
-            <w:r>
-              <w:t>fee paying</w:t>
-            </w:r>
-            <w:proofErr w:type="gramEnd"/>
-            <w:r>
-              <w:t xml:space="preserve"> student.</w:t>
-            </w:r>
-          </w:p>
-          <w:p/>
-          <w:p>
-            <w:pPr>
+            </w:pPr>
+            <w:r>
               <w:rPr>
                 <w:b/>
                 <w:bCs/>
                 <w:u w:val="single"/>
               </w:rPr>
-            </w:pPr>
-            <w:r>
+              <w:t>Student</w:t>
+            </w:r>
+          </w:p>
+          <w:p>
+            <w:pPr>
+              <w:rPr>
+                <w:b/>
+                <w:bCs/>
+              </w:rPr>
+            </w:pPr>
+            <w:r>
+              <w:rPr>
+                <w:b/>
+                <w:bCs/>
+              </w:rPr>
+              <w:t xml:space="preserve">I confirm that this is a representation of my signature and that I am in </w:t>
+            </w:r>
+            <w:proofErr w:type="gramStart"/>
+            <w:r>
+              <w:rPr>
+                <w:b/>
+                <w:bCs/>
+              </w:rPr>
+              <w:t>attendance</w:t>
+            </w:r>
+            <w:proofErr w:type="gramEnd"/>
+            <w:r>
+              <w:rPr>
+                <w:b/>
+                <w:bCs/>
+              </w:rPr>
+              <w:t xml:space="preserve"> and my Trainer/Assessor has confirmed with me that I am actively participating in training, learning and/or assessment in the units listed above with my Trainer/Assessor.</w:t>
+            </w:r>
+          </w:p>
+          <w:p/>
+          <w:p>
+            <w:r>
+              <w:t xml:space="preserve">I also confirm </w:t>
+            </w:r>
+            <w:proofErr w:type="gramStart"/>
+            <w:r>
+              <w:t>that where</w:t>
+            </w:r>
+            <w:proofErr w:type="gramEnd"/>
+            <w:r>
+              <w:t xml:space="preserve"> I have been deemed eligible under the Victorian Skills First Program for Government Subsidised training. I am residing in Victoria whilst studying this qualification and that I am physically present in Victoria </w:t>
+            </w:r>
+            <w:proofErr w:type="gramStart"/>
+            <w:r>
+              <w:t>at this time</w:t>
+            </w:r>
+            <w:proofErr w:type="gramEnd"/>
+            <w:r>
+              <w:t xml:space="preserve">.   </w:t>
+            </w:r>
+          </w:p>
+          <w:p>
+            <w:r>
+              <w:t>or</w:t>
+            </w:r>
+          </w:p>
+          <w:p>
+            <w:r>
+              <w:t xml:space="preserve">I am a full </w:t>
+            </w:r>
+            <w:proofErr w:type="gramStart"/>
+            <w:r>
+              <w:t>fee paying</w:t>
+            </w:r>
+            <w:proofErr w:type="gramEnd"/>
+            <w:r>
+              <w:t xml:space="preserve"> student.</w:t>
+            </w:r>
+          </w:p>
+          <w:p/>
+          <w:p>
+            <w:pPr>
               <w:rPr>
                 <w:b/>
                 <w:bCs/>
                 <w:u w:val="single"/>
               </w:rPr>
+            </w:pPr>
+            <w:r>
+              <w:rPr>
+                <w:b/>
+                <w:bCs/>
+                <w:u w:val="single"/>
+              </w:rPr>
               <w:t>Trainer/Assessor</w:t>
             </w:r>
           </w:p>
           <w:p>
             <w:r>
-              <w:t xml:space="preserve">I confirm that for the subjects listed above, I have been with the student, and checked that they are continuing to engage in the subjects for this qualification. </w:t>
+              <w:t xml:space="preserve">I confirm that for the subjects listed above, I have been with the </w:t>
+            </w:r>
+            <w:proofErr w:type="gramStart"/>
+            <w:r>
+              <w:t>student, and</w:t>
+            </w:r>
+            <w:proofErr w:type="gramEnd"/>
+            <w:r>
+              <w:t xml:space="preserve"> checked that they are continuing to engage in the subjects for this qualification. </w:t>
             </w:r>
           </w:p>
           <w:p/>
@@ -12528,6 +13054,7 @@
               <w:calendar w:val="gregorian"/>
             </w:date>
           </w:sdtPr>
+          <w:sdtEndPr/>
           <w:sdtContent>
             <w:tc>
               <w:tcPr>
@@ -14478,6 +15005,93 @@
         </w:p>
       </w:docPartBody>
     </w:docPart>
+    <w:docPart>
+      <w:docPartPr>
+        <w:name w:val="8C2F36A8D6FD4861BA6B88F9D097A3A3"/>
+        <w:category>
+          <w:name w:val="General"/>
+          <w:gallery w:val="placeholder"/>
+        </w:category>
+        <w:types>
+          <w:type w:val="bbPlcHdr"/>
+        </w:types>
+        <w:behaviors>
+          <w:behavior w:val="content"/>
+        </w:behaviors>
+        <w:guid w:val="{43E1AF7F-F550-4F40-A506-B3127EFCBE3F}"/>
+      </w:docPartPr>
+      <w:docPartBody>
+        <w:p>
+          <w:pPr>
+            <w:pStyle w:val="8C2F36A8D6FD4861BA6B88F9D097A3A3"/>
+          </w:pPr>
+          <w:r>
+            <w:rPr>
+              <w:rStyle w:val="PlaceholderText"/>
+            </w:rPr>
+            <w:t>Choose an item.</w:t>
+          </w:r>
+        </w:p>
+      </w:docPartBody>
+    </w:docPart>
+    <w:docPart>
+      <w:docPartPr>
+        <w:name w:val="6D55CB894E20488784FE6C525AF37AB7"/>
+        <w:category>
+          <w:name w:val="General"/>
+          <w:gallery w:val="placeholder"/>
+        </w:category>
+        <w:types>
+          <w:type w:val="bbPlcHdr"/>
+        </w:types>
+        <w:behaviors>
+          <w:behavior w:val="content"/>
+        </w:behaviors>
+        <w:guid w:val="{0AD72081-2E4F-4E3C-A8A8-6A3E68FDBC43}"/>
+      </w:docPartPr>
+      <w:docPartBody>
+        <w:p>
+          <w:pPr>
+            <w:pStyle w:val="6D55CB894E20488784FE6C525AF37AB7"/>
+          </w:pPr>
+          <w:r>
+            <w:rPr>
+              <w:rStyle w:val="PlaceholderText"/>
+            </w:rPr>
+            <w:t>Choose an item.</w:t>
+          </w:r>
+        </w:p>
+      </w:docPartBody>
+    </w:docPart>
+    <w:docPart>
+      <w:docPartPr>
+        <w:name w:val="20C903A35C194B90AEF179D16814BFA9"/>
+        <w:category>
+          <w:name w:val="General"/>
+          <w:gallery w:val="placeholder"/>
+        </w:category>
+        <w:types>
+          <w:type w:val="bbPlcHdr"/>
+        </w:types>
+        <w:behaviors>
+          <w:behavior w:val="content"/>
+        </w:behaviors>
+        <w:guid w:val="{FF08C58F-99A9-4B2E-A0DA-924032B54EF8}"/>
+      </w:docPartPr>
+      <w:docPartBody>
+        <w:p>
+          <w:pPr>
+            <w:pStyle w:val="20C903A35C194B90AEF179D16814BFA9"/>
+          </w:pPr>
+          <w:r>
+            <w:rPr>
+              <w:rStyle w:val="PlaceholderText"/>
+            </w:rPr>
+            <w:t>Choose an item.</w:t>
+          </w:r>
+        </w:p>
+      </w:docPartBody>
+    </w:docPart>
   </w:docParts>
 </w:glossaryDocument>
 </file>
@@ -14554,8 +15168,10 @@
     <w:rsid w:val="00020D3F"/>
     <w:rsid w:val="000E326B"/>
     <w:rsid w:val="00145302"/>
+    <w:rsid w:val="001615EC"/>
     <w:rsid w:val="00177ED4"/>
     <w:rsid w:val="00184168"/>
+    <w:rsid w:val="00195E2C"/>
     <w:rsid w:val="001C6CCD"/>
     <w:rsid w:val="001E2B4B"/>
     <w:rsid w:val="0020585C"/>
@@ -14569,6 +15185,7 @@
     <w:rsid w:val="002E2B37"/>
     <w:rsid w:val="00420D16"/>
     <w:rsid w:val="00457BF9"/>
+    <w:rsid w:val="004D7467"/>
     <w:rsid w:val="0051117A"/>
     <w:rsid w:val="00524AB1"/>
     <w:rsid w:val="005348B8"/>
@@ -14578,7 +15195,10 @@
     <w:rsid w:val="00630646"/>
     <w:rsid w:val="006623CA"/>
     <w:rsid w:val="00666DFF"/>
+    <w:rsid w:val="006C6302"/>
     <w:rsid w:val="006D482D"/>
+    <w:rsid w:val="007B4692"/>
+    <w:rsid w:val="007B4FFE"/>
     <w:rsid w:val="007E3B15"/>
     <w:rsid w:val="007F0AB6"/>
     <w:rsid w:val="007F5E36"/>
@@ -14586,18 +15206,25 @@
     <w:rsid w:val="0085241E"/>
     <w:rsid w:val="00852523"/>
     <w:rsid w:val="008759F8"/>
+    <w:rsid w:val="008A48FA"/>
+    <w:rsid w:val="008F1FD5"/>
+    <w:rsid w:val="00911ECF"/>
     <w:rsid w:val="00913FE4"/>
     <w:rsid w:val="009714CD"/>
     <w:rsid w:val="0097166F"/>
     <w:rsid w:val="009A5131"/>
     <w:rsid w:val="009D0836"/>
     <w:rsid w:val="009D52C2"/>
+    <w:rsid w:val="009F741F"/>
     <w:rsid w:val="00A54ED7"/>
     <w:rsid w:val="00A7388C"/>
+    <w:rsid w:val="00AC2FC1"/>
     <w:rsid w:val="00AD0E87"/>
+    <w:rsid w:val="00AE61DE"/>
     <w:rsid w:val="00B347A6"/>
     <w:rsid w:val="00B65F16"/>
     <w:rsid w:val="00C2384C"/>
+    <w:rsid w:val="00C81B80"/>
     <w:rsid w:val="00D04BAA"/>
     <w:rsid w:val="00D1489A"/>
     <w:rsid w:val="00D270F8"/>
@@ -15068,9 +15695,9 @@
     <w:basedOn w:val="DefaultParagraphFont"/>
     <w:uiPriority w:val="99"/>
     <w:semiHidden/>
-    <w:rsid w:val="00666DFF"/>
+    <w:rsid w:val="00195E2C"/>
     <w:rPr>
-      <w:color w:val="808080"/>
+      <w:color w:val="666666"/>
     </w:rPr>
   </w:style>
   <w:style w:type="paragraph" w:customStyle="1" w:styleId="6ADE8BB6407C4CACB2E25319DD949F11">
@@ -15366,6 +15993,45 @@
       <w:sz w:val="24"/>
       <w:szCs w:val="24"/>
       <w:lang w:val="en-NZ" w:eastAsia="en-NZ"/>
+      <w14:ligatures w14:val="standardContextual"/>
+    </w:rPr>
+  </w:style>
+  <w:style w:type="paragraph" w:customStyle="1" w:styleId="8C2F36A8D6FD4861BA6B88F9D097A3A3">
+    <w:name w:val="8C2F36A8D6FD4861BA6B88F9D097A3A3"/>
+    <w:rsid w:val="006C6302"/>
+    <w:pPr>
+      <w:spacing w:line="278" w:lineRule="auto"/>
+    </w:pPr>
+    <w:rPr>
+      <w:kern w:val="2"/>
+      <w:sz w:val="24"/>
+      <w:szCs w:val="24"/>
+      <w14:ligatures w14:val="standardContextual"/>
+    </w:rPr>
+  </w:style>
+  <w:style w:type="paragraph" w:customStyle="1" w:styleId="20C903A35C194B90AEF179D16814BFA9">
+    <w:name w:val="20C903A35C194B90AEF179D16814BFA9"/>
+    <w:rsid w:val="00195E2C"/>
+    <w:pPr>
+      <w:spacing w:line="278" w:lineRule="auto"/>
+    </w:pPr>
+    <w:rPr>
+      <w:kern w:val="2"/>
+      <w:sz w:val="24"/>
+      <w:szCs w:val="24"/>
+      <w14:ligatures w14:val="standardContextual"/>
+    </w:rPr>
+  </w:style>
+  <w:style w:type="paragraph" w:customStyle="1" w:styleId="6D55CB894E20488784FE6C525AF37AB7">
+    <w:name w:val="6D55CB894E20488784FE6C525AF37AB7"/>
+    <w:rsid w:val="009F741F"/>
+    <w:pPr>
+      <w:spacing w:line="278" w:lineRule="auto"/>
+    </w:pPr>
+    <w:rPr>
+      <w:kern w:val="2"/>
+      <w:sz w:val="24"/>
+      <w:szCs w:val="24"/>
       <w14:ligatures w14:val="standardContextual"/>
     </w:rPr>
   </w:style>

</xml_diff>